<commit_message>
Doc updated: LCP02 updated
</commit_message>
<xml_diff>
--- a/6. Documentation With Templates/LCP02/LCP02-AIRBAG-ECU-001_Concept_v_110.docx
+++ b/6. Documentation With Templates/LCP02/LCP02-AIRBAG-ECU-001_Concept_v_110.docx
@@ -522,14 +522,13 @@
             <w:vAlign w:val="center"/>
           </w:tcPr>
           <w:p>
-            <w:proofErr w:type="spellStart"/>
             <w:r>
               <w:rPr>
                 <w:color w:val="000000"/>
                 <w:sz w:val="18"/>
                 <w:szCs w:val="18"/>
               </w:rPr>
-              <w:t>Alita,</w:t>
+              <w:t>Alita</w:t>
             </w:r>
             <w:r>
               <w:rPr>
@@ -537,16 +536,15 @@
                 <w:sz w:val="18"/>
                 <w:szCs w:val="18"/>
               </w:rPr>
-              <w:t>Fateme</w:t>
-            </w:r>
-            <w:proofErr w:type="spellEnd"/>
+              <w:t xml:space="preserve">, </w:t>
+            </w:r>
             <w:r>
               <w:rPr>
                 <w:color w:val="000000"/>
                 <w:sz w:val="18"/>
                 <w:szCs w:val="18"/>
               </w:rPr>
-              <w:t>,</w:t>
+              <w:t>Fateme,</w:t>
             </w:r>
             <w:r>
               <w:rPr>

</xml_diff>